<commit_message>
Correct reviewed document layouts and complete reference metadata
</commit_message>
<xml_diff>
--- a/research/release-candidates/preprint-short-formats-20260924/inputs/CSPG4-letter-supplement.docx
+++ b/research/release-candidates/preprint-short-formats-20260924/inputs/CSPG4-letter-supplement.docx
@@ -18486,17 +18486,9 @@
 <w:ftr xmlns:m="http://schemas.openxmlformats.org/officeDocument/2006/math" xmlns:mc="http://schemas.openxmlformats.org/markup-compatibility/2006" xmlns:mo="http://schemas.microsoft.com/office/mac/office/2008/main" xmlns:mv="urn:schemas-microsoft-com:mac:vml" xmlns:o="urn:schemas-microsoft-com:office:office" xmlns:r="http://schemas.openxmlformats.org/officeDocument/2006/relationships" xmlns:v="urn:schemas-microsoft-com:vml" xmlns:w10="urn:schemas-microsoft-com:office:word" xmlns:w14="http://schemas.microsoft.com/office/word/2010/wordml" xmlns:w="http://schemas.openxmlformats.org/wordprocessingml/2006/main" xmlns:wne="http://schemas.microsoft.com/office/word/2006/wordml" xmlns:wp14="http://schemas.microsoft.com/office/word/2010/wordprocessingDrawing" xmlns:wp="http://schemas.openxmlformats.org/drawingml/2006/wordprocessingDrawing" xmlns:wpc="http://schemas.microsoft.com/office/word/2010/wordprocessingCanvas" xmlns:wpg="http://schemas.microsoft.com/office/word/2010/wordprocessingGroup" xmlns:wpi="http://schemas.microsoft.com/office/word/2010/wordprocessingInk" xmlns:wps="http://schemas.microsoft.com/office/word/2010/wordprocessingShape" mc:Ignorable="w14 wp14">
   <w:p>
     <w:pPr>
-      <w:pStyle w:val="Footer"/>
       <w:spacing w:after="0"/>
       <w:jc w:val="center"/>
     </w:pPr>
-    <w:r>
-      <w:rPr>
-        <w:sz w:val="18"/>
-      </w:rPr>
-      <w:t xml:space="preserve">CSPG4 RNA across sarcoma types  |  </w:t>
-    </w:r>
-    <w:fldSimple w:instr="PAGE"/>
     <w:r>
       <w:rPr>
         <w:sz w:val="18"/>

</xml_diff>

<commit_message>
Restore original CSPG4 Figure1 and clarify initial comparator selection
</commit_message>
<xml_diff>
--- a/research/release-candidates/preprint-short-formats-20260924/inputs/CSPG4-letter-supplement.docx
+++ b/research/release-candidates/preprint-short-formats-20260924/inputs/CSPG4-letter-supplement.docx
@@ -39,7 +39,7 @@
         <w:rPr>
           <w:b w:val="0"/>
         </w:rPr>
-        <w:t>Myxoid liposarcoma (MLPS), low-grade fibromyxoid sarcoma (LGFMS) and synovial sarcoma were investigator-selected for morphological and diagnostic relevance. No scoring system established them as the three closest EMC mimics. The array comparisons were determined by available tumor types: LGFMS, MFS, desmoid and SFT were present in both collections. Broader references instead applied the source-class rules to every eligible category. The full atlas preserves all 60 labels, including the categories outside those references.</w:t>
+        <w:t>Myxoid liposarcoma (MLPS), low-grade fibromyxoid sarcoma (LGFMS) and synovial sarcoma were selected within this reanalysis for morphological and diagnostic relevance to EMC, rather than designated as comparator groups by the source investigators. No scoring system established them as the three closest EMC mimics. The array comparisons were determined by available tumor types: LGFMS, MFS, desmoid and SFT were present in both collections. Broader references instead applied the source-class rules to every eligible category. The full atlas preserves all 60 labels, including the categories outside those references.</w:t>
       </w:r>
     </w:p>
     <w:p>
@@ -4703,7 +4703,7 @@
         <w:rPr>
           <w:b w:val="0"/>
         </w:rPr>
-        <w:t>The 242 eligible specimens outside the defined malignant comparison remain visible, including source-classified benign and intermediate tumors, melanoma and unclassified tumors. The display uses the same specimen values and graphical conventions as Figure S3; its Intermediate groups overlap the broader reference now shown there. This retained panel still gives all 242 specimens outside the primary comparison. No high-expression category was omitted because it weakens an EMC-specific interpretation. Original source diagnoses and classes, including any historical spelling, are retained in Table S3.</w:t>
+        <w:t>The 242 eligible specimens outside the defined malignant comparison remain visible, including source-classified benign and intermediate tumors, melanoma and unclassified tumors. The display uses the same specimen values and graphical conventions as Figure 1; its Intermediate groups overlap the broader reference now shown there. This retained panel still gives all 242 specimens outside the primary comparison. No high-expression category was omitted because it weakens an EMC-specific interpretation. Original source diagnoses and classes, including any historical spelling, are retained in Table S3.</w:t>
       </w:r>
     </w:p>
     <w:p>
@@ -18340,83 +18340,8 @@
       <w:r>
         <w:drawing>
           <wp:inline xmlns:a="http://schemas.openxmlformats.org/drawingml/2006/main" xmlns:pic="http://schemas.openxmlformats.org/drawingml/2006/picture">
-            <wp:extent cx="8686800" cy="5754294"/>
+            <wp:extent cx="8686800" cy="3566884"/>
             <wp:docPr id="3" name="Picture 3"/>
-            <wp:cNvGraphicFramePr>
-              <a:graphicFrameLocks noChangeAspect="1"/>
-            </wp:cNvGraphicFramePr>
-            <a:graphic>
-              <a:graphicData uri="http://schemas.openxmlformats.org/drawingml/2006/picture">
-                <pic:pic>
-                  <pic:nvPicPr>
-                    <pic:cNvPr id="0" name="figure-1.png"/>
-                    <pic:cNvPicPr/>
-                  </pic:nvPicPr>
-                  <pic:blipFill>
-                    <a:blip r:embed="rId12"/>
-                    <a:stretch>
-                      <a:fillRect/>
-                    </a:stretch>
-                  </pic:blipFill>
-                  <pic:spPr>
-                    <a:xfrm>
-                      <a:off x="0" y="0"/>
-                      <a:ext cx="8686800" cy="5754294"/>
-                    </a:xfrm>
-                    <a:prstGeom prst="rect"/>
-                  </pic:spPr>
-                </pic:pic>
-              </a:graphicData>
-            </a:graphic>
-          </wp:inline>
-        </w:drawing>
-      </w:r>
-    </w:p>
-    <w:p>
-      <w:pPr>
-        <w:spacing w:line="250" w:lineRule="auto"/>
-      </w:pPr>
-      <w:r>
-        <w:rPr>
-          <w:b w:val="0"/>
-          <w:sz w:val="18"/>
-        </w:rPr>
-      </w:r>
-      <w:r>
-        <w:rPr>
-          <w:b/>
-          <w:sz w:val="18"/>
-        </w:rPr>
-        <w:t>Figure S3. CSPG4 RNA across sarcoma and related tumor categories.</w:t>
-      </w:r>
-      <w:r>
-        <w:rPr>
-          <w:b w:val="0"/>
-          <w:sz w:val="18"/>
-        </w:rPr>
-        <w:t xml:space="preserve"> The 498 specimens span 38 source diagnosis labels: nine EMC, 393 primary-reference specimens and 96 additional specimens marked by asterisks. Asterisks identify categories classified as Intermediate in the source; all other non-EMC rows form the Malignant-category reference. The broader reference includes both sets. Dots show specimens, horizontal segments interquartile ranges and vertical marks medians. The axis uses log2(1+TPM) spacing with TPM labels; categories are ordered by observed median. Other eligible contexts appear in Figure S1. MIFS/HFLT, myxoinflammatory fibroblastic sarcoma/hemosiderotic fibrolipomatous tumor; NOS, not otherwise specified.</w:t>
-      </w:r>
-    </w:p>
-    <w:p>
-      <w:pPr>
-        <w:sectPr>
-          <w:pgSz w:w="15840" w:h="12240" w:orient="landscape"/>
-          <w:pgMar w:top="648" w:right="936" w:bottom="648" w:left="936" w:header="720" w:footer="720" w:gutter="0"/>
-          <w:cols w:space="720"/>
-          <w:docGrid w:linePitch="360"/>
-        </w:sectPr>
-      </w:pPr>
-    </w:p>
-    <w:p>
-      <w:pPr>
-        <w:spacing w:after="120" w:line="240" w:lineRule="auto"/>
-        <w:jc w:val="center"/>
-      </w:pPr>
-      <w:r>
-        <w:drawing>
-          <wp:inline xmlns:a="http://schemas.openxmlformats.org/drawingml/2006/main" xmlns:pic="http://schemas.openxmlformats.org/drawingml/2006/picture">
-            <wp:extent cx="8686800" cy="3566884"/>
-            <wp:docPr id="4" name="Picture 4"/>
             <wp:cNvGraphicFramePr>
               <a:graphicFrameLocks noChangeAspect="1"/>
             </wp:cNvGraphicFramePr>
@@ -18428,7 +18353,7 @@
                     <pic:cNvPicPr/>
                   </pic:nvPicPr>
                   <pic:blipFill>
-                    <a:blip r:embed="rId13"/>
+                    <a:blip r:embed="rId12"/>
                     <a:stretch>
                       <a:fillRect/>
                     </a:stretch>
@@ -18462,7 +18387,7 @@
           <w:b/>
           <w:sz w:val="18"/>
         </w:rPr>
-        <w:t>Figure S4. Direct EMC comparisons shared across two assays.</w:t>
+        <w:t>Figure S3. Direct EMC comparisons shared across two assays.</w:t>
       </w:r>
       <w:r>
         <w:rPr>

</xml_diff>